<commit_message>
Capitalize all language names consistently in CV documents
</commit_message>
<xml_diff>
--- a/dist/assets/documents/Krystyna-Mishchenko-CV-PL.docx
+++ b/dist/assets/documents/Krystyna-Mishchenko-CV-PL.docx
@@ -420,7 +420,7 @@
               <w:jc w:val="left"/>
             </w:pPr>
             <w:r>
-              <w:t>rosyjski — na poziomie rodzimego użytkownika</w:t>
+              <w:t>Rosyjski — na poziomie rodzimego użytkownika</w:t>
             </w:r>
           </w:p>
         </w:tc>
@@ -435,7 +435,7 @@
               <w:jc w:val="left"/>
             </w:pPr>
             <w:r>
-              <w:t>niemiecki — B1, potwierdzony certyfikatem</w:t>
+              <w:t>Niemiecki — B1, potwierdzony certyfikatem</w:t>
             </w:r>
           </w:p>
         </w:tc>
@@ -463,7 +463,7 @@
               <w:jc w:val="left"/>
             </w:pPr>
             <w:r>
-              <w:t>angielski — początkujący.</w:t>
+              <w:t>Angielski — początkujący.</w:t>
             </w:r>
           </w:p>
         </w:tc>

</xml_diff>